<commit_message>
[US00] - Atualizacao de Documetacao do Projeto
</commit_message>
<xml_diff>
--- a/documentos/Resumo Tecnico do Case 1.docx
+++ b/documentos/Resumo Tecnico do Case 1.docx
@@ -543,35 +543,7 @@
             <w:lang w:eastAsia="pt-BR"/>
             <w14:ligatures w14:val="none"/>
           </w:rPr>
-          <w:t>Swagg</w:t>
-        </w:r>
-        <w:r>
-          <w:rPr>
-            <w:rStyle w:val="Hyperlink"/>
-            <w:rFonts w:ascii="Segoe UI" w:eastAsia="Times New Roman" w:hAnsi="Segoe UI" w:cs="Segoe UI"/>
-            <w:b/>
-            <w:bCs/>
-            <w:kern w:val="0"/>
-            <w:sz w:val="21"/>
-            <w:szCs w:val="21"/>
-            <w:lang w:eastAsia="pt-BR"/>
-            <w14:ligatures w14:val="none"/>
-          </w:rPr>
-          <w:t>e</w:t>
-        </w:r>
-        <w:r>
-          <w:rPr>
-            <w:rStyle w:val="Hyperlink"/>
-            <w:rFonts w:ascii="Segoe UI" w:eastAsia="Times New Roman" w:hAnsi="Segoe UI" w:cs="Segoe UI"/>
-            <w:b/>
-            <w:bCs/>
-            <w:kern w:val="0"/>
-            <w:sz w:val="21"/>
-            <w:szCs w:val="21"/>
-            <w:lang w:eastAsia="pt-BR"/>
-            <w14:ligatures w14:val="none"/>
-          </w:rPr>
-          <w:t>r UI</w:t>
+          <w:t>Swagger UI</w:t>
         </w:r>
       </w:hyperlink>
     </w:p>
@@ -1494,6 +1466,7 @@
           <w:bCs/>
           <w:lang w:eastAsia="pt-BR"/>
         </w:rPr>
+        <w:lastRenderedPageBreak/>
         <w:t xml:space="preserve">Antes de começar </w:t>
       </w:r>
       <w:r>
@@ -1520,7 +1493,6 @@
         <w:rPr>
           <w:lang w:eastAsia="pt-BR"/>
         </w:rPr>
-        <w:lastRenderedPageBreak/>
         <w:t>Instale a versão 21 do Java </w:t>
       </w:r>
       <w:r>
@@ -1973,6 +1945,7 @@
           <w:bCs/>
           <w:lang w:eastAsia="pt-BR"/>
         </w:rPr>
+        <w:lastRenderedPageBreak/>
         <w:t xml:space="preserve">Testes automatizados com Karate </w:t>
       </w:r>
       <w:r>
@@ -2008,7 +1981,6 @@
         <w:rPr>
           <w:lang w:eastAsia="pt-BR"/>
         </w:rPr>
-        <w:lastRenderedPageBreak/>
         <w:t>1- . ./setantenv.sh</w:t>
       </w:r>
     </w:p>
@@ -2463,6 +2435,7 @@
           <w:lang w:eastAsia="pt-BR"/>
           <w14:ligatures w14:val="none"/>
         </w:rPr>
+        <w:lastRenderedPageBreak/>
         <w:t>Diagrama C1</w:t>
       </w:r>
     </w:p>
@@ -2485,7 +2458,6 @@
         <w:rPr>
           <w:noProof/>
         </w:rPr>
-        <w:lastRenderedPageBreak/>
         <w:drawing>
           <wp:inline distT="0" distB="0" distL="0" distR="0" wp14:anchorId="53AFF005" wp14:editId="58256EDC">
             <wp:extent cx="5400040" cy="2294890"/>
@@ -2682,6 +2654,7 @@
         <w:rPr>
           <w:noProof/>
         </w:rPr>
+        <w:lastRenderedPageBreak/>
         <w:drawing>
           <wp:inline distT="0" distB="0" distL="0" distR="0" wp14:anchorId="4511F2B0" wp14:editId="46EC9A31">
             <wp:extent cx="5400040" cy="2666365"/>
@@ -2741,8 +2714,7 @@
           <w:lang w:eastAsia="pt-BR"/>
           <w14:ligatures w14:val="none"/>
         </w:rPr>
-        <w:lastRenderedPageBreak/>
-        <w:t>Para referência e melhor resolução dos diagramas, segue o link para a documentação original:</w:t>
+        <w:t>Para referência e melhor resolução dos diagramas, segue o link para a documentação:</w:t>
       </w:r>
     </w:p>
     <w:p>
@@ -2769,10 +2741,38 @@
             <w:lang w:eastAsia="pt-BR"/>
             <w14:ligatures w14:val="none"/>
           </w:rPr>
-          <w:t>https://drive.google.com/file/d/1fQczPNdY0zlspPY76O7exIpbVPe61pWF/view?usp=sharing</w:t>
+          <w:t>POC-RFI-2026.d</w:t>
+        </w:r>
+        <w:r>
+          <w:rPr>
+            <w:rStyle w:val="Hyperlink"/>
+            <w:rFonts w:ascii="Segoe UI" w:eastAsia="Times New Roman" w:hAnsi="Segoe UI" w:cs="Segoe UI"/>
+            <w:kern w:val="0"/>
+            <w:sz w:val="20"/>
+            <w:szCs w:val="20"/>
+            <w:lang w:eastAsia="pt-BR"/>
+            <w14:ligatures w14:val="none"/>
+          </w:rPr>
+          <w:t>r</w:t>
+        </w:r>
+        <w:r>
+          <w:rPr>
+            <w:rStyle w:val="Hyperlink"/>
+            <w:rFonts w:ascii="Segoe UI" w:eastAsia="Times New Roman" w:hAnsi="Segoe UI" w:cs="Segoe UI"/>
+            <w:kern w:val="0"/>
+            <w:sz w:val="20"/>
+            <w:szCs w:val="20"/>
+            <w:lang w:eastAsia="pt-BR"/>
+            <w14:ligatures w14:val="none"/>
+          </w:rPr>
+          <w:t>awio.pdf</w:t>
         </w:r>
       </w:hyperlink>
-      <w:r>
+    </w:p>
+    <w:p>
+      <w:pPr>
+        <w:spacing w:before="100" w:beforeAutospacing="1" w:after="100" w:afterAutospacing="1" w:line="300" w:lineRule="atLeast"/>
+        <w:outlineLvl w:val="2"/>
         <w:rPr>
           <w:rFonts w:ascii="Segoe UI" w:eastAsia="Times New Roman" w:hAnsi="Segoe UI" w:cs="Segoe UI"/>
           <w:kern w:val="0"/>
@@ -2781,8 +2781,7 @@
           <w:lang w:eastAsia="pt-BR"/>
           <w14:ligatures w14:val="none"/>
         </w:rPr>
-        <w:br/>
-      </w:r>
+      </w:pPr>
     </w:p>
     <w:p>
       <w:pPr>
@@ -3095,6 +3094,7 @@
           <w:lang w:eastAsia="pt-BR"/>
           <w14:ligatures w14:val="none"/>
         </w:rPr>
+        <w:lastRenderedPageBreak/>
         <w:t>Voce vera as duas entidades monitoradas: o SAPCommerce e o Sistema Operacional</w:t>
       </w:r>
     </w:p>
@@ -3203,7 +3203,6 @@
           <w:lang w:eastAsia="pt-BR"/>
           <w14:ligatures w14:val="none"/>
         </w:rPr>
-        <w:lastRenderedPageBreak/>
         <w:drawing>
           <wp:inline distT="0" distB="0" distL="0" distR="0" wp14:anchorId="36CDB9A0" wp14:editId="2E1BDB7C">
             <wp:extent cx="5400040" cy="3042285"/>
@@ -3287,6 +3286,7 @@
           <w:lang w:eastAsia="pt-BR"/>
           <w14:ligatures w14:val="none"/>
         </w:rPr>
+        <w:lastRenderedPageBreak/>
         <w:drawing>
           <wp:inline distT="0" distB="0" distL="0" distR="0" wp14:anchorId="0004B8FC" wp14:editId="1C2F5656">
             <wp:extent cx="5400040" cy="2392045"/>
@@ -3735,7 +3735,6 @@
           <w:lang w:val="en-US" w:eastAsia="pt-BR"/>
           <w14:ligatures w14:val="none"/>
         </w:rPr>
-        <w:lastRenderedPageBreak/>
         <w:t>/{</w:t>
       </w:r>
       <w:proofErr w:type="spellStart"/>
@@ -4186,6 +4185,7 @@
           <w:lang w:eastAsia="pt-BR"/>
           <w14:ligatures w14:val="none"/>
         </w:rPr>
+        <w:lastRenderedPageBreak/>
         <w:t xml:space="preserve">Foram utilizados os seguintes arquivos impex extras </w:t>
       </w:r>
       <w:r>
@@ -4826,9 +4826,8 @@
           <w:szCs w:val="21"/>
           <w:lang w:eastAsia="pt-BR"/>
         </w:rPr>
-        <w:lastRenderedPageBreak/>
         <w:pict w14:anchorId="00018F7A">
-          <v:rect id="_x0000_i1075" style="width:425.2pt;height:.05pt" o:hralign="center" o:hrstd="t" o:hr="t" fillcolor="#a0a0a0" stroked="f"/>
+          <v:rect id="_x0000_i1027" style="width:425.2pt;height:.05pt" o:hralign="center" o:hrstd="t" o:hr="t" fillcolor="#a0a0a0" stroked="f"/>
         </w:pict>
       </w:r>
     </w:p>
@@ -6349,6 +6348,7 @@
                 <w:lang w:val="en-US" w:eastAsia="pt-BR"/>
                 <w14:ligatures w14:val="none"/>
               </w:rPr>
+              <w:lastRenderedPageBreak/>
               <w:t>Configurar</w:t>
             </w:r>
             <w:proofErr w:type="spellEnd"/>
@@ -9702,7 +9702,6 @@
                 <w:lang w:val="en-US" w:eastAsia="pt-BR"/>
                 <w14:ligatures w14:val="none"/>
               </w:rPr>
-              <w:lastRenderedPageBreak/>
               <w:t>Mapear</w:t>
             </w:r>
             <w:proofErr w:type="spellEnd"/>
@@ -11145,6 +11144,7 @@
                 <w:lang w:val="en-US" w:eastAsia="pt-BR"/>
                 <w14:ligatures w14:val="none"/>
               </w:rPr>
+              <w:lastRenderedPageBreak/>
               <w:t>Configurar</w:t>
             </w:r>
             <w:proofErr w:type="spellEnd"/>
@@ -15808,7 +15808,6 @@
                 <w:lang w:val="en-US" w:eastAsia="pt-BR"/>
                 <w14:ligatures w14:val="none"/>
               </w:rPr>
-              <w:lastRenderedPageBreak/>
               <w:t>Geração</w:t>
             </w:r>
             <w:proofErr w:type="spellEnd"/>
@@ -16089,8 +16088,9 @@
           <w:szCs w:val="21"/>
           <w:lang w:eastAsia="pt-BR"/>
         </w:rPr>
+        <w:lastRenderedPageBreak/>
         <w:pict w14:anchorId="2E592DBD">
-          <v:rect id="_x0000_i1077" style="width:425.2pt;height:.05pt" o:hralign="center" o:hrstd="t" o:hr="t" fillcolor="#a0a0a0" stroked="f"/>
+          <v:rect id="_x0000_i1028" style="width:425.2pt;height:.05pt" o:hralign="center" o:hrstd="t" o:hr="t" fillcolor="#a0a0a0" stroked="f"/>
         </w:pict>
       </w:r>
     </w:p>
@@ -16581,7 +16581,7 @@
           <w:lang w:eastAsia="pt-BR"/>
         </w:rPr>
         <w:pict w14:anchorId="1207F4DC">
-          <v:rect id="_x0000_i1078" style="width:425.2pt;height:.05pt" o:hralign="center" o:hrstd="t" o:hr="t" fillcolor="#a0a0a0" stroked="f"/>
+          <v:rect id="_x0000_i1029" style="width:425.2pt;height:.05pt" o:hralign="center" o:hrstd="t" o:hr="t" fillcolor="#a0a0a0" stroked="f"/>
         </w:pict>
       </w:r>
     </w:p>
@@ -16695,7 +16695,6 @@
           <w:lang w:eastAsia="pt-BR"/>
           <w14:ligatures w14:val="none"/>
         </w:rPr>
-        <w:lastRenderedPageBreak/>
         <w:t>Swagger atualizado</w:t>
       </w:r>
     </w:p>
@@ -16780,6 +16779,7 @@
           <w:lang w:eastAsia="pt-BR"/>
           <w14:ligatures w14:val="none"/>
         </w:rPr>
+        <w:lastRenderedPageBreak/>
         <w:t>Testes automatizados</w:t>
       </w:r>
     </w:p>
@@ -16833,7 +16833,7 @@
           <w:lang w:eastAsia="pt-BR"/>
         </w:rPr>
         <w:pict w14:anchorId="04490FFA">
-          <v:rect id="_x0000_i1079" style="width:425.2pt;height:.05pt" o:hralign="center" o:hrstd="t" o:hr="t" fillcolor="#a0a0a0" stroked="f"/>
+          <v:rect id="_x0000_i1030" style="width:425.2pt;height:.05pt" o:hralign="center" o:hrstd="t" o:hr="t" fillcolor="#a0a0a0" stroked="f"/>
         </w:pict>
       </w:r>
     </w:p>
@@ -16949,10 +16949,10 @@
             <v:path o:extrusionok="f" gradientshapeok="t" o:connecttype="rect"/>
             <o:lock v:ext="edit" aspectratio="t"/>
           </v:shapetype>
-          <v:shape id="_x0000_i1080" type="#_x0000_t75" style="width:76.5pt;height:49.5pt" o:ole="">
+          <v:shape id="_x0000_i1031" type="#_x0000_t75" style="width:76.5pt;height:49.5pt" o:ole="">
             <v:imagedata r:id="rId29" o:title=""/>
           </v:shape>
-          <o:OLEObject Type="Embed" ProgID="Package" ShapeID="_x0000_i1080" DrawAspect="Icon" ObjectID="_1835438246" r:id="rId30"/>
+          <o:OLEObject Type="Embed" ProgID="Package" ShapeID="_x0000_i1031" DrawAspect="Icon" ObjectID="_1835764999" r:id="rId30"/>
         </w:object>
       </w:r>
     </w:p>
@@ -18938,6 +18938,7 @@
   <w:style w:type="character" w:default="1" w:styleId="DefaultParagraphFont">
     <w:name w:val="Default Paragraph Font"/>
     <w:uiPriority w:val="1"/>
+    <w:semiHidden/>
     <w:unhideWhenUsed/>
   </w:style>
   <w:style w:type="table" w:default="1" w:styleId="TableNormal">

</xml_diff>